<commit_message>
feat: refresh training runtime and experience
</commit_message>
<xml_diff>
--- a/docs/申报书输出/烽火笔锋_申报书_规范长版.docx
+++ b/docs/申报书输出/烽火笔锋_申报书_规范长版.docx
@@ -2,7 +2,7 @@
 <file path=word/document.xml><?xml version="1.0" encoding="utf-8"?>
 <w:document xmlns:w="http://schemas.openxmlformats.org/wordprocessingml/2006/main" xmlns:m="http://schemas.openxmlformats.org/officeDocument/2006/math" xmlns:r="http://schemas.openxmlformats.org/officeDocument/2006/relationships" xmlns:o="urn:schemas-microsoft-com:office:office" xmlns:v="urn:schemas-microsoft-com:vml" xmlns:w10="urn:schemas-microsoft-com:office:word" xmlns:a="http://schemas.openxmlformats.org/drawingml/2006/main" xmlns:pic="http://schemas.openxmlformats.org/drawingml/2006/picture" xmlns:wp="http://schemas.openxmlformats.org/drawingml/2006/wordprocessingDrawing">
   <w:body>
-    <w:bookmarkStart w:id="26" w:name="烽火笔锋项目申报书规范长版"/>
+    <w:bookmarkStart w:id="28" w:name="烽火笔锋项目申报书规范长版"/>
     <w:p>
       <w:pPr>
         <w:pStyle w:val="Heading1"/>
@@ -118,6 +118,26 @@
       </w:r>
       <w:r>
         <w:t xml:space="preserve">一体化教学模式；二是能够提升学生在复杂、高压、不完全信息环境中的判断与沟通能力，增强媒介素养与公共责任意识；三是能够形成具有推广价值的数字化训练模板，为高校课程改革和智能教育应用提供新范式；四是能够在技术层面验证大语言模型、知识追踪、结构化场景库和训练推荐机制在教育实践中的应用潜力。</w:t>
+      </w:r>
+    </w:p>
+    <w:p>
+      <w:pPr>
+        <w:pStyle w:val="BodyText"/>
+      </w:pPr>
+      <w:r>
+        <w:t xml:space="preserve">从外部数据看，该项目具有明确的规模化应用基础。国家统计局《2024年国民经济和社会发展统计公报》显示，2024年全国研究生招生135.7万人、在学研究生409.5万人，本专科在校生3891.3万人，说明高等教育实践教学需求基数巨大。CNNIC第55次《中国互联网络发展状况统计报告》显示，截至2024年12月我国网民规模达11.08亿人，其中生成式人工智能产品用户达2.49亿人，AI工具使用已具备较高社会渗透率，为</w:t>
+      </w:r>
+      <w:r>
+        <w:t xml:space="preserve">“</w:t>
+      </w:r>
+      <w:r>
+        <w:t xml:space="preserve">AI+课程训练</w:t>
+      </w:r>
+      <w:r>
+        <w:t xml:space="preserve">”</w:t>
+      </w:r>
+      <w:r>
+        <w:t xml:space="preserve">提供了现实技术土壤。</w:t>
       </w:r>
     </w:p>
     <w:bookmarkEnd w:id="20"/>
@@ -166,6 +186,38 @@
         <w:t xml:space="preserve">结合本项目现有基础分析，项目已由早期的剧情交互系统迭代升级为训练型系统，后端已形成较完整的训练主链路，包括训练初始化、场景推进、回合评估、能力状态更新、训练记录持久化、结局与报告生成等模块，同时已配置场景库、运行参数、推荐策略和训练观测结构。这说明项目不仅具有理论研究基础，而且具备较强的工程落地条件，为后续深化研究和成果推广提供了保障。</w:t>
       </w:r>
     </w:p>
+    <w:p>
+      <w:pPr>
+        <w:pStyle w:val="BodyText"/>
+      </w:pPr>
+      <w:r>
+        <w:t xml:space="preserve">从教育数字化发展环境看，项目推广条件持续增强。新华社2025年5月发布的世界数字教育大会信息显示，国家智慧教育公共服务平台注册用户已达1.64亿，浏览量超过613亿，用户覆盖220多个国家和地区，说明</w:t>
+      </w:r>
+      <w:r>
+        <w:t xml:space="preserve">“</w:t>
+      </w:r>
+      <w:r>
+        <w:t xml:space="preserve">平台化数字教育资源+智能教学应用</w:t>
+      </w:r>
+      <w:r>
+        <w:t xml:space="preserve">”</w:t>
+      </w:r>
+      <w:r>
+        <w:t xml:space="preserve">的组织形态已形成规模效应。本项目可作为</w:t>
+      </w:r>
+      <w:r>
+        <w:t xml:space="preserve">“</w:t>
+      </w:r>
+      <w:r>
+        <w:t xml:space="preserve">历史情境+能力训练</w:t>
+      </w:r>
+      <w:r>
+        <w:t xml:space="preserve">”</w:t>
+      </w:r>
+      <w:r>
+        <w:t xml:space="preserve">细分场景接入该类生态，具备现实迁移基础。</w:t>
+      </w:r>
+    </w:p>
     <w:bookmarkEnd w:id="21"/>
     <w:bookmarkStart w:id="22" w:name="三项目研究内容和目标"/>
     <w:p>
@@ -351,7 +403,7 @@
         <w:pStyle w:val="FirstParagraph"/>
       </w:pPr>
       <w:r>
-        <w:t xml:space="preserve">结合当前实际开发情况，项目已完成训练后端主链路建设，具备训练初始化、下一场景获取、回合提交、进度查询和训练报告生成等核心功能，训练模块相关单元测试已经通过，说明系统原型已具备稳定运行基础。下一步将重点推进前端训练页面、报告可视化、场景内容扩充和教学应用验证。</w:t>
+        <w:t xml:space="preserve">结合当前实际开发情况，项目已形成可量化的工程基线：训练域配置了8个结构化场景（6个主线场景+2个分支场景）；能力模型覆盖8项核心技能维度和6项状态维度；规则引擎内置5类关键规则与2类高风险硬惩罚；训练相关API（含媒体任务）共12个；训练域代码规模为32个Python模块、约10272行。测试方面，截至2026年3月26日，训练域自动化测试执行结果为235项通过、6项失败、1项跳过（共242项），其中训练主链路烟雾回归17项全部通过，说明系统已具备持续迭代与教学试用基础。下一步将重点推进前端训练页面、报告可视化、场景内容扩充和教学应用验证，并完成剩余失败用例的契约对齐修复。</w:t>
       </w:r>
     </w:p>
     <w:bookmarkEnd w:id="23"/>
@@ -539,7 +591,147 @@
       </w:r>
     </w:p>
     <w:bookmarkEnd w:id="25"/>
+    <w:bookmarkStart w:id="26" w:name="七材料佐证与数据支撑建议随申报附后"/>
+    <w:p>
+      <w:pPr>
+        <w:pStyle w:val="Heading2"/>
+      </w:pPr>
+      <w:r>
+        <w:t xml:space="preserve">七、材料佐证与数据支撑（建议随申报附后）</w:t>
+      </w:r>
+    </w:p>
+    <w:p>
+      <w:pPr>
+        <w:numPr>
+          <w:ilvl w:val="0"/>
+          <w:numId w:val="1005"/>
+        </w:numPr>
+        <w:pStyle w:val="Compact"/>
+      </w:pPr>
+      <w:r>
+        <w:t xml:space="preserve">政策依据材料。建议附《教育强国建设规划纲要（2024—2035年）》相关条款摘录，用于证明项目与国家教育数字化和高质量人才培养方向一致。</w:t>
+      </w:r>
+    </w:p>
+    <w:p>
+      <w:pPr>
+        <w:numPr>
+          <w:ilvl w:val="0"/>
+          <w:numId w:val="1005"/>
+        </w:numPr>
+        <w:pStyle w:val="Compact"/>
+      </w:pPr>
+      <w:r>
+        <w:t xml:space="preserve">统计数据材料。建议附国家统计局《2024年国民经济和社会发展统计公报》教育章节和CNNIC第55次报告核心数据页，用于支撑</w:t>
+      </w:r>
+      <w:r>
+        <w:t xml:space="preserve">“</w:t>
+      </w:r>
+      <w:r>
+        <w:t xml:space="preserve">需求规模大、AI使用基础好</w:t>
+      </w:r>
+      <w:r>
+        <w:t xml:space="preserve">”</w:t>
+      </w:r>
+      <w:r>
+        <w:t xml:space="preserve">的立项论证。</w:t>
+      </w:r>
+    </w:p>
+    <w:p>
+      <w:pPr>
+        <w:numPr>
+          <w:ilvl w:val="0"/>
+          <w:numId w:val="1005"/>
+        </w:numPr>
+        <w:pStyle w:val="Compact"/>
+      </w:pPr>
+      <w:r>
+        <w:t xml:space="preserve">行业环境材料。建议附新华社关于世界数字教育大会与《中国智慧教育白皮书》发布信息，用于支撑项目在数字教育生态中的可推广性。</w:t>
+      </w:r>
+    </w:p>
+    <w:p>
+      <w:pPr>
+        <w:numPr>
+          <w:ilvl w:val="0"/>
+          <w:numId w:val="1005"/>
+        </w:numPr>
+        <w:pStyle w:val="Compact"/>
+      </w:pPr>
+      <w:r>
+        <w:t xml:space="preserve">项目工程材料。建议附场景库配置清单、能力图谱配置、API清单、测试报告（含2026年3月26日测试结果）作为可复核证据。</w:t>
+      </w:r>
+    </w:p>
+    <w:p>
+      <w:pPr>
+        <w:numPr>
+          <w:ilvl w:val="0"/>
+          <w:numId w:val="1005"/>
+        </w:numPr>
+        <w:pStyle w:val="Compact"/>
+      </w:pPr>
+      <w:r>
+        <w:t xml:space="preserve">数据口径说明。外部数据统一采用2024年末至2025年上半年公开口径；项目内部数据统一采用当前代码基线实测口径（统计日期：2026年3月26日）。</w:t>
+      </w:r>
+    </w:p>
     <w:bookmarkEnd w:id="26"/>
+    <w:bookmarkStart w:id="27" w:name="参考来源建议在附件中给出原文或截图"/>
+    <w:p>
+      <w:pPr>
+        <w:pStyle w:val="Heading2"/>
+      </w:pPr>
+      <w:r>
+        <w:t xml:space="preserve">参考来源（建议在附件中给出原文或截图）</w:t>
+      </w:r>
+    </w:p>
+    <w:p>
+      <w:pPr>
+        <w:numPr>
+          <w:ilvl w:val="0"/>
+          <w:numId w:val="1006"/>
+        </w:numPr>
+        <w:pStyle w:val="Compact"/>
+      </w:pPr>
+      <w:r>
+        <w:t xml:space="preserve">国家统计局：《中华人民共和国2024年国民经济和社会发展统计公报》，2025年2月28日发布。https://www.stats.gov.cn/sj/zxfb/202502/t20250228_1958817.html</w:t>
+      </w:r>
+    </w:p>
+    <w:p>
+      <w:pPr>
+        <w:numPr>
+          <w:ilvl w:val="0"/>
+          <w:numId w:val="1006"/>
+        </w:numPr>
+        <w:pStyle w:val="Compact"/>
+      </w:pPr>
+      <w:r>
+        <w:t xml:space="preserve">中国互联网络信息中心（CNNIC）：第55次《中国互联网络发展状况统计报告》发布信息，2025年1月17日。https://www.cnnic.cn/n4/2025/0117/c88-11229.html</w:t>
+      </w:r>
+    </w:p>
+    <w:p>
+      <w:pPr>
+        <w:numPr>
+          <w:ilvl w:val="0"/>
+          <w:numId w:val="1006"/>
+        </w:numPr>
+        <w:pStyle w:val="Compact"/>
+      </w:pPr>
+      <w:r>
+        <w:t xml:space="preserve">新华社：《教育部部长怀进鹏：国家智慧教育公共服务平台注册用户突破1.64亿》，2025年5月16日。https://www.news.cn/20250516/2ca8300c9d3540ef979e53f522f0d79a/c.html</w:t>
+      </w:r>
+    </w:p>
+    <w:p>
+      <w:pPr>
+        <w:numPr>
+          <w:ilvl w:val="0"/>
+          <w:numId w:val="1006"/>
+        </w:numPr>
+        <w:pStyle w:val="Compact"/>
+      </w:pPr>
+      <w:r>
+        <w:t xml:space="preserve">新华社：《中共中央 国务院印发〈教育强国建设规划纲要（2024—2035年）〉》，2025年1月19日。https://www.xinhuanet.com/politics/20250119/2832cc83299f4cf287dab5c489d68447/c.html</w:t>
+      </w:r>
+    </w:p>
+    <w:bookmarkEnd w:id="27"/>
+    <w:bookmarkEnd w:id="28"/>
     <w:sectPr/>
   </w:body>
 </w:document>
@@ -825,6 +1017,66 @@
     </w:lvlOverride>
   </w:num>
   <w:num w:numId="1004">
+    <w:abstractNumId w:val="99411"/>
+    <w:lvlOverride w:ilvl="0">
+      <w:startOverride w:val="1"/>
+    </w:lvlOverride>
+    <w:lvlOverride w:ilvl="1">
+      <w:startOverride w:val="1"/>
+    </w:lvlOverride>
+    <w:lvlOverride w:ilvl="2">
+      <w:startOverride w:val="1"/>
+    </w:lvlOverride>
+    <w:lvlOverride w:ilvl="3">
+      <w:startOverride w:val="1"/>
+    </w:lvlOverride>
+    <w:lvlOverride w:ilvl="4">
+      <w:startOverride w:val="1"/>
+    </w:lvlOverride>
+    <w:lvlOverride w:ilvl="5">
+      <w:startOverride w:val="1"/>
+    </w:lvlOverride>
+    <w:lvlOverride w:ilvl="6">
+      <w:startOverride w:val="1"/>
+    </w:lvlOverride>
+    <w:lvlOverride w:ilvl="7">
+      <w:startOverride w:val="1"/>
+    </w:lvlOverride>
+    <w:lvlOverride w:ilvl="8">
+      <w:startOverride w:val="1"/>
+    </w:lvlOverride>
+  </w:num>
+  <w:num w:numId="1005">
+    <w:abstractNumId w:val="99411"/>
+    <w:lvlOverride w:ilvl="0">
+      <w:startOverride w:val="1"/>
+    </w:lvlOverride>
+    <w:lvlOverride w:ilvl="1">
+      <w:startOverride w:val="1"/>
+    </w:lvlOverride>
+    <w:lvlOverride w:ilvl="2">
+      <w:startOverride w:val="1"/>
+    </w:lvlOverride>
+    <w:lvlOverride w:ilvl="3">
+      <w:startOverride w:val="1"/>
+    </w:lvlOverride>
+    <w:lvlOverride w:ilvl="4">
+      <w:startOverride w:val="1"/>
+    </w:lvlOverride>
+    <w:lvlOverride w:ilvl="5">
+      <w:startOverride w:val="1"/>
+    </w:lvlOverride>
+    <w:lvlOverride w:ilvl="6">
+      <w:startOverride w:val="1"/>
+    </w:lvlOverride>
+    <w:lvlOverride w:ilvl="7">
+      <w:startOverride w:val="1"/>
+    </w:lvlOverride>
+    <w:lvlOverride w:ilvl="8">
+      <w:startOverride w:val="1"/>
+    </w:lvlOverride>
+  </w:num>
+  <w:num w:numId="1006">
     <w:abstractNumId w:val="99411"/>
     <w:lvlOverride w:ilvl="0">
       <w:startOverride w:val="1"/>

</xml_diff>